<commit_message>
Marcus & Millichap materials after honesty check
Co-Authored-By: Claude Opus 5.5 <noreply@anthropic.com>
Claude-Session: https://claude.ai/code/session_01VpCXqDFSAKkK8y6mKL2HCw
</commit_message>
<xml_diff>
--- a/applications/marcus-and-millichap-senior-marketing-manager/build/Joshua_Chappell_CoverLetter_MarcusMillichap.docx
+++ b/applications/marcus-and-millichap-senior-marketing-manager/build/Joshua_Chappell_CoverLetter_MarcusMillichap.docx
@@ -27,7 +27,7 @@
         </w:rPr>
         <w:t xml:space="preserve">Mesa, AZ  •  480-586-7959  •  </w:t>
       </w:r>
-      <w:hyperlink w:history="1" r:id="rIdyjrzwqestf6vh8sydposj">
+      <w:hyperlink w:history="1" r:id="rIdcd8ijux25n-ft93l3ktjn">
         <w:r>
           <w:rPr>
             <w:rFonts w:ascii="Calibri" w:cs="Calibri" w:eastAsia="Calibri" w:hAnsi="Calibri"/>
@@ -47,7 +47,7 @@
         </w:rPr>
         <w:t xml:space="preserve">  •  </w:t>
       </w:r>
-      <w:hyperlink w:history="1" r:id="rIdpavz686o5ehb5ke8hoe2z">
+      <w:hyperlink w:history="1" r:id="rId0rf_2kqub3h_lzpdpg7vz">
         <w:r>
           <w:rPr>
             <w:rFonts w:ascii="Calibri" w:cs="Calibri" w:eastAsia="Calibri" w:hAnsi="Calibri"/>
@@ -67,7 +67,7 @@
         </w:rPr>
         <w:t xml:space="preserve">  •  </w:t>
       </w:r>
-      <w:hyperlink w:history="1" r:id="rIdfhnaq3g22rg99qoqzhbl4">
+      <w:hyperlink w:history="1" r:id="rIdis3gnbluih2uhpmnsprfi">
         <w:r>
           <w:rPr>
             <w:rFonts w:ascii="Calibri" w:cs="Calibri" w:eastAsia="Calibri" w:hAnsi="Calibri"/>
@@ -87,7 +87,7 @@
         </w:rPr>
         <w:t xml:space="preserve">  •  </w:t>
       </w:r>
-      <w:hyperlink w:history="1" r:id="rIdek0mpivoc7nosxfb63sho">
+      <w:hyperlink w:history="1" r:id="rIdprp_gthfm_2zhri6qcydy">
         <w:r>
           <w:rPr>
             <w:rFonts w:ascii="Calibri" w:cs="Calibri" w:eastAsia="Calibri" w:hAnsi="Calibri"/>
@@ -138,7 +138,7 @@
           <w:sz w:val="22"/>
           <w:szCs w:val="22"/>
         </w:rPr>
-        <w:t xml:space="preserve">Your Corporate Marketing group needs someone who plans the work, sets scope and goals with internal stakeholders, and carries cross-functional projects to the finish. That is how I run my own company. At Lightbox Digital I delivered 98% of projects on time and 92% within budget while commanding teams of 5 to 20 people per project. At Grand Canyon Education I crystallized scope of work and synchronized departments with competing interests to meet and exceed stakeholder goals. I have run projects in Wrike, Notion, Trello, and Workamajig, so moving into Asana is a short step.</w:t>
+        <w:t xml:space="preserve">Your Corporate Marketing group needs someone who plans the work, sets scope and goals with internal stakeholders, and carries cross-functional projects to the finish. That is how I run my own company. At Lightbox Digital I delivered 98% of projects on time and 92% within budget while commanding teams of 5 to 20 people per project. At Grand Canyon Education I crystallized scope of work and synchronized with multiple departments with competing interests to meet and exceed stakeholder goals. I have used Wrike, Notion, Trello, and Workamajig for project management, so moving into Asana is a short step.</w:t>
       </w:r>
     </w:p>
     <w:p>
@@ -152,7 +152,7 @@
           <w:sz w:val="22"/>
           <w:szCs w:val="22"/>
         </w:rPr>
-        <w:t xml:space="preserve">On the campaign side, at Charter One I created and led a video initiative that raised click-through rates for running ads by over 200%, and a social media content initiative that drove 20x more engagement than standard content. I have worked in residential real estate: I filmed model homes for Blandford Homes and photographed homes for realtors. I have produced creative work for seven years, so I speak the same language as your design team. My storyboards slashed back-and-forth communication by over 50%, and I hold a Master's in Marketing with a specialization in Marketing Analytics.</w:t>
+        <w:t xml:space="preserve">On the campaign side, at Charter One I created and led a video initiative that raised click-through rates for running ads by over 200%, and a social media content initiative that drove 20x more engagement than standard content. I have worked with residential real estate clients: I filmed model homes for Blandford Homes and photographed homes for realtors. I have produced creative work for seven years and can partner with your design team. My storyboards slashed back-and-forth communication by over 50%, and I hold a Master's in Marketing with a specialization in Marketing Analytics.</w:t>
       </w:r>
     </w:p>
     <w:p>

</xml_diff>